<commit_message>
Add menu to lab 2 program
</commit_message>
<xml_diff>
--- a/Лабораторная 2/Счётчик калорий.docx
+++ b/Лабораторная 2/Счётчик калорий.docx
@@ -2056,7 +2056,7 @@
     </w:p>
     <w:p>
       <w:r>
-        <w:t>Диаграмма объектов показывает состояние программы в учебном примере после подтверждения порции. Такое же состояние получается при запуске программы. Каталог содержит продукты «Хлопья» (352 ккал на 100 г) и «Молоко» (52 ккал на 100 г). Каша содержит два ингредиента — 40 г хлопьев и 200 г молока, её готовая масса 220 г, общие калории 244,8 ккал. Дневник содержит порцию каши массой 110 г и калорийностью 122,4 ккал. Обработчик связан с каталогом и дневником.</w:t>
+        <w:t>Диаграмма объектов показывает состояние программы в учебном примере после подтверждения порции. Такое же состояние получается, если ввести учебный пример в программе. Каталог содержит продукты «Хлопья» (352 ккал на 100 г) и «Молоко» (52 ккал на 100 г). Каша содержит два ингредиента — 40 г хлопьев и 200 г молока, её готовая масса 220 г, общие калории 244,8 ккал. Дневник содержит порцию каши массой 110 г и калорийностью 122,4 ккал. Обработчик связан с каталогом и дневником.</w:t>
       </w:r>
     </w:p>
     <w:p>
@@ -2545,7 +2545,7 @@
     </w:p>
     <w:p>
       <w:r>
-        <w:t>Код написан на языке C# для платформы .NET 10 и находится в решении Counter/CalorieCounter.slnx. Консольный проект CalorieCounter содержит классы диаграммы классов, каждый в отдельном файле пространства имён CalorieCounter. Проект CalorieCounter.Tests содержит автоматические тесты xUnit.</w:t>
+        <w:t>Код написан на языке C# для платформы .NET 10 и лежит в папке Counter. Решение CalorieCounter.slnx состоит из двух проектов: консольный CalorieCounter содержит классы диаграммы классов, каждый в отдельном файле пространства имён CalorieCounter, а CalorieCounter.Tests — автоматические тесты xUnit.</w:t>
       </w:r>
     </w:p>
     <w:p>
@@ -3180,7 +3180,7 @@
         <w:spacing w:before="240"/>
       </w:pPr>
       <w:r>
-        <w:t>Метод Main воспроизводит учебный пример: создаёт каталог с двумя продуктами, собирает кашу, запрашивает предпросмотр порций массой 300 г и 110 г и подтверждает вторую. Программа выводит калорийность каши 111,3 ккал на 100 г, отказ для порции 300 г, предпросмотр порции 110 г на 122,4 ккал и итог за день 122,4 ккал. Тесты проверяют расчёты для учебного примера и правила предпросмотра и подтверждения; все 26 тестов проходят.</w:t>
+        <w:t>Метод Main запускает консольное меню: пользователь вносит в каталог продукты с калорийностью с этикетки, готовит из них блюдо (операция CreateBatch), записывает порцию продукта или блюда в два шага — предпросмотр (Preview) и подтверждение (Confirm) — и смотрит итог за день (CalculateDayKcal). Для учебного примера программа выводит 111,3 ккал на 100 г каши и 122,4 ккал для порции 110 г, а порцию 300 г отклоняет. Все 26 тестов проходят.</w:t>
       </w:r>
     </w:p>
     <w:sectPr>

</xml_diff>

<commit_message>
Remove lab 2 tests
</commit_message>
<xml_diff>
--- a/Лабораторная 2/Счётчик калорий.docx
+++ b/Лабораторная 2/Счётчик калорий.docx
@@ -2252,7 +2252,7 @@
               <w:rPr>
                 <w:b w:val="0"/>
               </w:rPr>
-              <w:t>Сверит значения полей и связи объектов в тестах и при отладке с ожидаемыми</w:t>
+              <w:t>Введёт учебный пример в программе и сверит значения полей и связи объектов при отладке с ожидаемыми</w:t>
             </w:r>
           </w:p>
         </w:tc>
@@ -2545,7 +2545,7 @@
     </w:p>
     <w:p>
       <w:r>
-        <w:t>Код написан на языке C# для платформы .NET 10 и лежит в папке Counter. Решение CalorieCounter.slnx состоит из двух проектов: консольный CalorieCounter содержит классы диаграммы классов, каждый в отдельном файле пространства имён CalorieCounter, а CalorieCounter.Tests — автоматические тесты xUnit.</w:t>
+        <w:t>Код написан на языке C# для платформы .NET 10 и лежит в папке Counter. Решение CalorieCounter.slnx содержит консольный проект CalorieCounter: классы диаграммы классов находятся в нём, каждый в отдельном файле пространства имён CalorieCounter.</w:t>
       </w:r>
     </w:p>
     <w:p>
@@ -3180,7 +3180,7 @@
         <w:spacing w:before="240"/>
       </w:pPr>
       <w:r>
-        <w:t>Метод Main запускает консольное меню: пользователь вносит в каталог продукты с калорийностью с этикетки, готовит из них блюдо (операция CreateBatch), записывает порцию продукта или блюда в два шага — предпросмотр (Preview) и подтверждение (Confirm) — и смотрит итог за день (CalculateDayKcal). Для учебного примера программа выводит 111,3 ккал на 100 г каши и 122,4 ккал для порции 110 г, а порцию 300 г отклоняет. Все 26 тестов проходят.</w:t>
+        <w:t>Метод Main запускает консольное меню: пользователь вносит в каталог продукты с калорийностью с этикетки, готовит из них блюдо (операция CreateBatch), записывает порцию продукта или блюда в два шага — предпросмотр (Preview) и подтверждение (Confirm) — и смотрит итог за день (CalculateDayKcal). Для учебного примера программа выводит 111,3 ккал на 100 г каши и 122,4 ккал для порции 110 г, а порцию 300 г отклоняет.</w:t>
       </w:r>
     </w:p>
     <w:sectPr>

</xml_diff>

<commit_message>
Fix lab 2 after review
</commit_message>
<xml_diff>
--- a/Лабораторная 2/Счётчик калорий.docx
+++ b/Лабораторная 2/Счётчик калорий.docx
@@ -43,7 +43,7 @@
     </w:p>
     <w:p>
       <w:r>
-        <w:t>Калории фиксируются при создании объектов: общие калории партии накапливаются при добавлении ингредиентов, калории порции рассчитываются в её конструкторе, и последующие изменения каталога их не меняют. Операция Preview может не сформировать порцию, поэтому у её результата указана кратность [0..1]. Классы, их члены и связи представлены на рисунке 1, описание диаграммы приведено в таблице 1.</w:t>
+        <w:t>Калории фиксируются при создании объектов: общие калории партии накапливаются при добавлении ингредиентов, калории порции рассчитываются в её конструкторе, и последующие изменения каталога их не меняют. Операция Preview может не сформировать порцию, поэтому у её результата указана кратность [0..1]. У каталога, обработчика и дневника нет атрибутов, поэтому раздел атрибутов у них не изображается. Классы, их члены и связи представлены на рисунке 1, описание диаграммы приведено в таблице 1.</w:t>
       </w:r>
     </w:p>
     <w:p>
@@ -444,7 +444,7 @@
               <w:rPr>
                 <w:b w:val="0"/>
               </w:rPr>
-              <w:t>– типы Real, String, Boolean и DateTime реализуются типами double, string, bool и DateTime;</w:t>
+              <w:t>– типы Real, String, Boolean и DateTime реализуются типами double, string, bool и DateTime, а набор пар (String, Real) [1..*] — словарём Dictionary&lt;string, double&gt;;</w:t>
             </w:r>
           </w:p>
           <w:p>
@@ -498,7 +498,7 @@
       <w:r>
         <w:drawing>
           <wp:inline xmlns:a="http://schemas.openxmlformats.org/drawingml/2006/main" xmlns:pic="http://schemas.openxmlformats.org/drawingml/2006/picture">
-            <wp:extent cx="9072000" cy="5730289"/>
+            <wp:extent cx="9072000" cy="5732402"/>
             <wp:docPr id="1" name="Picture 1"/>
             <wp:cNvGraphicFramePr>
               <a:graphicFrameLocks noChangeAspect="1"/>
@@ -519,7 +519,7 @@
                   <pic:spPr>
                     <a:xfrm>
                       <a:off x="0" y="0"/>
-                      <a:ext cx="9072000" cy="5730289"/>
+                      <a:ext cx="9072000" cy="5732402"/>
                     </a:xfrm>
                     <a:prstGeom prst="rect"/>
                   </pic:spPr>
@@ -554,12 +554,12 @@
     </w:p>
     <w:p>
       <w:r>
-        <w:t>Диаграмма описывает операцию CreateBatch обработчика учёта порции, которая создаёт приготовленную партию по названию, готовой массе и составу. Состав передаётся словарём: ключ — название продукта из каталога, значение — его масса в граммах. Во взаимодействии участвуют обработчик, каталог продуктов catalog и создаваемая партия batch. Диаграмма демонстрирует фрейм цикла.</w:t>
+        <w:t>Диаграмма описывает операцию CreateBatch обработчика учёта порции, которая создаёт приготовленную партию по названию, готовой массе и составу. Состав — набор пар (String, Real) [1..*]: название продукта из каталога и масса в граммах; в коде ему соответствует словарь Dictionary&lt;string, double&gt;. Участвуют обработчик, каталог catalog и создаваемая партия batch. Диаграмма демонстрирует фрейм цикла.</w:t>
       </w:r>
     </w:p>
     <w:p>
       <w:r>
-        <w:t>Сначала обработчик создаёт пустую партию сообщением new(name, readyMassG). Блок партии расположен ниже остальных, так как объект появляется только в этот момент. Затем во фрейме loop для каждой пары «название — масса» обработчик находит продукт в каталоге, сохраняет его в переменную product и передаёт партии вместе с массой операцией AddIngredient; её устройство показано на отдельной диаграмме. После цикла партия возвращается вызывающему объекту. В учебном примере цикл выполняется дважды: для 40 г хлопьев и для 200 г молока. Взаимодействие представлено на рисунке 2, описание диаграммы — в таблице 2.</w:t>
+        <w:t>Сначала обработчик создаёт пустую партию сообщением new(name, readyMassG): блок партии стоит ниже остальных, так как объект появляется в этот момент. Затем во фрейме loop для каждой пары (productName, massG) обработчик находит продукт в каталоге, сохраняет его в переменную product и передаёт партии вместе с массой операцией AddIngredient (рисунок 4). Она результата не возвращает, поэтому возврат показан пунктиром без подписи. После цикла партия возвращается вызывающему объекту. На рисунке 2 показано приготовление каши из учебного примера: цикл выполняется дважды — для 40 г хлопьев и для 200 г молока. Описание диаграммы приведено в таблице 2.</w:t>
       </w:r>
     </w:p>
     <w:p>
@@ -960,7 +960,7 @@
               <w:rPr>
                 <w:b w:val="0"/>
               </w:rPr>
-              <w:t>– пара (productName, massG) — элемент словаря Dictionary&lt;string, double&gt;, в коде цикл записывается оператором foreach с разложением пары;</w:t>
+              <w:t>– набор пар в коде — словарь Dictionary&lt;string, double&gt;, цикл — оператор foreach; названия не повторяются, так как ключи словаря уникальны, хотя кратность этого не выражает;</w:t>
             </w:r>
           </w:p>
           <w:p>
@@ -1000,7 +1000,7 @@
       <w:r>
         <w:drawing>
           <wp:inline xmlns:a="http://schemas.openxmlformats.org/drawingml/2006/main" xmlns:pic="http://schemas.openxmlformats.org/drawingml/2006/picture">
-            <wp:extent cx="9072000" cy="5355406"/>
+            <wp:extent cx="9072000" cy="5292301"/>
             <wp:docPr id="2" name="Picture 2"/>
             <wp:cNvGraphicFramePr>
               <a:graphicFrameLocks noChangeAspect="1"/>
@@ -1021,7 +1021,7 @@
                   <pic:spPr>
                     <a:xfrm>
                       <a:off x="0" y="0"/>
-                      <a:ext cx="9072000" cy="5355406"/>
+                      <a:ext cx="9072000" cy="5292301"/>
                     </a:xfrm>
                     <a:prstGeom prst="rect"/>
                   </pic:spPr>
@@ -1043,7 +1043,7 @@
         </w:sectPr>
       </w:pPr>
       <w:r>
-        <w:t>Рисунок 2 – Диаграмма последовательностей операции CreateBatch</w:t>
+        <w:t>Рисунок 2 – Диаграмма последовательностей при приготовлении каши из хлопьев и молока</w:t>
       </w:r>
     </w:p>
     <w:p>
@@ -1056,17 +1056,17 @@
     </w:p>
     <w:p>
       <w:r>
-        <w:t>Диаграмма описывает операцию Preview обработчика учёта порции, которая формирует предпросмотр порции заданной массы из еды — продукта или приготовленной партии. Во взаимодействии участвуют обработчик, еда food и создаваемая порция preview. Участник food имеет абстрактный тип Food, поэтому то, какая реализация GetKcalPer100g будет выполнена, определяется во время работы программы. Диаграмма демонстрирует вложенные активности.</w:t>
+        <w:t>Диаграмма описывает операцию Preview обработчика учёта порции: предпросмотр порции заданной массы из еды — продукта или приготовленной партии. Участвуют обработчик, еда food и создаваемая порция preview. Участник food имеет абстрактный тип Food, поэтому реализация GetKcalPer100g выбирается во время работы программы. Диаграмма демонстрирует вложенные активности.</w:t>
       </w:r>
     </w:p>
     <w:p>
       <w:r>
-        <w:t>Обработчик спрашивает у еды, можно ли подать порцию такой массы, и сохраняет ответ в переменную canServe. Далее фрейм alt разделяет два случая. Если порцию подать можно, создаётся объект порции. Её конструктор вызывает у еды операцию CalculateKcal(massG), а эта операция — собственную операцию GetKcalPer100g. Активность самовызова вложена в активность CalculateKcal, которая выполняется во время активности конструктора порции. Результат сохраняется в свойство Kcal. В ветви [else] предпросмотр сбрасывается в null, чтобы ранее сформированный предпросмотр нельзя было подтвердить. Операция возвращает предпросмотр либо null, поэтому у её результата указана кратность [0..1].</w:t>
+        <w:t>Обработчик спрашивает у еды, можно ли подать порцию такой массы, и сохраняет ответ в canServe. Если можно, создаётся порция: её конструктор вызывает у еды CalculateKcal(massG), а та — собственную операцию GetKcalPer100g, самовызов показан петлёй. Активности вложены: CalculateKcal выполняется во время работы конструктора порции, а конструктор — во время Preview. Калории сохраняются в свойство Kcal, а порция возвращается обработчику в поле preview. В ветви [else] предпросмотр сбрасывается в null, чтобы прежний предпросмотр нельзя было подтвердить.</w:t>
       </w:r>
     </w:p>
     <w:p>
       <w:r>
-        <w:t>В учебном примере порция массой 110 г из каши даёт 122,4 ккал, а запрос порции массой 300 г возвращает null, так как превышает готовую массу 220 г. Взаимодействие представлено на рисунке 3, описание диаграммы — в таблице 3.</w:t>
+        <w:t>На рисунке 3 показан предпросмотр порции каши: 110 г дают 122,4 ккал, а 300 г больше готовой массы 220 г, и операция возвращает null. Описание диаграммы приведено в таблице 3.</w:t>
       </w:r>
     </w:p>
     <w:p>
@@ -1314,7 +1314,7 @@
               <w:rPr>
                 <w:b w:val="0"/>
               </w:rPr>
-              <w:t>– вложенные активности конструктор порции → CalculateKcal → GetKcalPer100g: калории рассчитываются один раз при создании порции;</w:t>
+              <w:t>– вложенные активности Preview → конструктор порции → CalculateKcal: калории рассчитываются один раз при создании порции;</w:t>
             </w:r>
           </w:p>
           <w:p>
@@ -1493,7 +1493,7 @@
       <w:r>
         <w:drawing>
           <wp:inline xmlns:a="http://schemas.openxmlformats.org/drawingml/2006/main" xmlns:pic="http://schemas.openxmlformats.org/drawingml/2006/picture">
-            <wp:extent cx="9072000" cy="5355406"/>
+            <wp:extent cx="9072000" cy="5292301"/>
             <wp:docPr id="3" name="Picture 3"/>
             <wp:cNvGraphicFramePr>
               <a:graphicFrameLocks noChangeAspect="1"/>
@@ -1514,7 +1514,7 @@
                   <pic:spPr>
                     <a:xfrm>
                       <a:off x="0" y="0"/>
-                      <a:ext cx="9072000" cy="5355406"/>
+                      <a:ext cx="9072000" cy="5292301"/>
                     </a:xfrm>
                     <a:prstGeom prst="rect"/>
                   </pic:spPr>
@@ -1536,7 +1536,7 @@
         </w:sectPr>
       </w:pPr>
       <w:r>
-        <w:t>Рисунок 3 – Диаграмма последовательностей операции Preview</w:t>
+        <w:t>Рисунок 3 – Диаграмма последовательностей при предпросмотре порции каши</w:t>
       </w:r>
     </w:p>
     <w:p>
@@ -1554,12 +1554,12 @@
     </w:p>
     <w:p>
       <w:r>
-        <w:t>Партия создаёт ингредиент сообщением new(product, massG): ингредиент является частью партии по композиции, поэтому его создаёт сама партия. Созданный ингредиент добавляется в список ingredients. Затем партия запрашивает у ингредиента калории. Ингредиент вызывает у продукта операцию CalculateKcal(massG), а продукт — собственную операцию GetKcalPer100g. Результат возвращается в переменную kcal и прибавляется к общим калориям партии totalKcal. Действия внутри операции, не являющиеся вызовами, изображены петлёй без активности.</w:t>
+        <w:t>Партия создаёт ингредиент сообщением new(product, massG): ингредиент является частью партии по композиции, поэтому его создаёт сама партия. Созданный ингредиент добавляется в список ingredients. Затем партия запрашивает у ингредиента калории. Ингредиент вызывает у продукта операцию CalculateKcal(massG), а продукт — собственную операцию GetKcalPer100g. Результат возвращается в переменную kcal и прибавляется к общим калориям партии totalKcal. Самовызов GetKcalPer100g и действия внутри операции изображены петлями. Операция результата не возвращает, поэтому по её завершении управление возвращается вызывающему объекту пунктиром без подписи.</w:t>
       </w:r>
     </w:p>
     <w:p>
       <w:r>
-        <w:t>Общие калории партии накапливаются при добавлении ингредиентов и далее не пересчитываются. В учебном примере после двух вызовов они составляют 140,8 + 104 = 244,8 ккал. Взаимодействие представлено на рисунке 4, описание диаграммы — в таблице 4.</w:t>
+        <w:t>Общие калории партии накапливаются при добавлении ингредиентов и далее не пересчитываются. На рисунке 4 показано добавление молока в кашу: 200 г молока дают 104 ккал, и вместе с хлопьями общие калории каши составляют 140,8 + 104 = 244,8 ккал. Описание диаграммы приведено в таблице 4.</w:t>
       </w:r>
     </w:p>
     <w:p>
@@ -1960,7 +1960,7 @@
               <w:rPr>
                 <w:b w:val="0"/>
               </w:rPr>
-              <w:t>– возврат из операции без результата (void) не изображён;</w:t>
+              <w:t>– возврат из операции без результата (void) показан пунктиром без подписи;</w:t>
             </w:r>
           </w:p>
           <w:p>
@@ -2000,7 +2000,7 @@
       <w:r>
         <w:drawing>
           <wp:inline xmlns:a="http://schemas.openxmlformats.org/drawingml/2006/main" xmlns:pic="http://schemas.openxmlformats.org/drawingml/2006/picture">
-            <wp:extent cx="9072000" cy="5355406"/>
+            <wp:extent cx="9072000" cy="5292301"/>
             <wp:docPr id="4" name="Picture 4"/>
             <wp:cNvGraphicFramePr>
               <a:graphicFrameLocks noChangeAspect="1"/>
@@ -2021,7 +2021,7 @@
                   <pic:spPr>
                     <a:xfrm>
                       <a:off x="0" y="0"/>
-                      <a:ext cx="9072000" cy="5355406"/>
+                      <a:ext cx="9072000" cy="5292301"/>
                     </a:xfrm>
                     <a:prstGeom prst="rect"/>
                   </pic:spPr>
@@ -2043,7 +2043,7 @@
         </w:sectPr>
       </w:pPr>
       <w:r>
-        <w:t>Рисунок 4 – Диаграмма последовательностей операции AddIngredient</w:t>
+        <w:t>Рисунок 4 – Диаграмма последовательностей при добавлении молока в кашу</w:t>
       </w:r>
     </w:p>
     <w:p>
@@ -2061,7 +2061,7 @@
     </w:p>
     <w:p>
       <w:r>
-        <w:t>Имена объектов подчёркнуты и записаны в виде «имя : Класс», под чертой указаны значения полей, включая унаследованное поле Name. Связи являются экземплярами ассоциаций, агрегаций и композиции диаграммы классов; у их концов подписаны роли. Диаграмма показывает значимую связь: ингредиенты ссылаются на те же объекты продуктов, что хранятся в каталоге, а порция — на партию, а не на продукты. Связи обработчика с предпросмотром нет, так как после подтверждения предпросмотр сброшен. Диаграмма представлена на рисунке 5, описание — в таблице 5.</w:t>
+        <w:t>Имена объектов подчёркнуты и записаны в виде «имя : Класс», под чертой указаны значения полей, включая унаследованное поле Name. Связи являются экземплярами ассоциаций, агрегаций и композиции диаграммы классов; у их концов подписаны роли. Диаграмма показывает значимую связь: ингредиенты ссылаются на те же объекты продуктов, что хранятся в каталоге, а порция — на партию, а не на продукты. Связи обработчика с предпросмотром нет, так как после подтверждения предпросмотр сброшен. На рисунке 5 показаны каша из хлопьев и молока и её порция в дневнике, описание диаграммы приведено в таблице 5.</w:t>
       </w:r>
     </w:p>
     <w:p>
@@ -2489,7 +2489,7 @@
       <w:r>
         <w:drawing>
           <wp:inline xmlns:a="http://schemas.openxmlformats.org/drawingml/2006/main" xmlns:pic="http://schemas.openxmlformats.org/drawingml/2006/picture">
-            <wp:extent cx="9072000" cy="5355406"/>
+            <wp:extent cx="9072000" cy="5358401"/>
             <wp:docPr id="5" name="Picture 5"/>
             <wp:cNvGraphicFramePr>
               <a:graphicFrameLocks noChangeAspect="1"/>
@@ -2510,7 +2510,7 @@
                   <pic:spPr>
                     <a:xfrm>
                       <a:off x="0" y="0"/>
-                      <a:ext cx="9072000" cy="5355406"/>
+                      <a:ext cx="9072000" cy="5358401"/>
                     </a:xfrm>
                     <a:prstGeom prst="rect"/>
                   </pic:spPr>
@@ -2532,7 +2532,7 @@
         </w:sectPr>
       </w:pPr>
       <w:r>
-        <w:t>Рисунок 5 – Диаграмма объектов после подтверждения порции каши</w:t>
+        <w:t>Рисунок 5 – Диаграмма объектов после записи порции каши в дневник</w:t>
       </w:r>
     </w:p>
     <w:p>
@@ -2785,6 +2785,49 @@
                 <w:b w:val="0"/>
               </w:rPr>
               <w:t>поле-список List&lt;T&gt;</w:t>
+            </w:r>
+          </w:p>
+        </w:tc>
+      </w:tr>
+      <w:tr>
+        <w:trPr>
+          <w:cantSplit/>
+        </w:trPr>
+        <w:tc>
+          <w:tcPr>
+            <w:tcW w:type="dxa" w:w="2551"/>
+          </w:tcPr>
+          <w:p>
+            <w:pPr>
+              <w:keepNext/>
+              <w:spacing w:line="240" w:lineRule="auto" w:before="0" w:after="0"/>
+              <w:ind w:firstLine="0"/>
+              <w:jc w:val="left"/>
+            </w:pPr>
+            <w:r>
+              <w:rPr>
+                <w:b w:val="0"/>
+              </w:rPr>
+              <w:t>Набор пар (String, Real) [1..*]</w:t>
+            </w:r>
+          </w:p>
+        </w:tc>
+        <w:tc>
+          <w:tcPr>
+            <w:tcW w:type="dxa" w:w="6803"/>
+          </w:tcPr>
+          <w:p>
+            <w:pPr>
+              <w:keepNext/>
+              <w:spacing w:line="240" w:lineRule="auto" w:before="0" w:after="0"/>
+              <w:ind w:firstLine="0"/>
+              <w:jc w:val="left"/>
+            </w:pPr>
+            <w:r>
+              <w:rPr>
+                <w:b w:val="0"/>
+              </w:rPr>
+              <w:t>словарь Dictionary&lt;string, double&gt;</w:t>
             </w:r>
           </w:p>
         </w:tc>

</xml_diff>